<commit_message>
atualiza relatorio e link do video
</commit_message>
<xml_diff>
--- a/docs/Integração Sistema de Informação.docx
+++ b/docs/Integração Sistema de Informação.docx
@@ -188,25 +188,23 @@
     </w:p>
     <w:sdt>
       <w:sdtPr>
+        <w:id w:val="-134029462"/>
+        <w:docPartObj>
+          <w:docPartGallery w:val="Table of Contents"/>
+          <w:docPartUnique/>
+        </w:docPartObj>
+      </w:sdtPr>
+      <w:sdtEndPr>
         <w:rPr>
           <w:rFonts w:asciiTheme="minorHAnsi" w:eastAsiaTheme="minorHAnsi" w:hAnsiTheme="minorHAnsi" w:cstheme="minorBidi"/>
+          <w:b/>
+          <w:bCs/>
           <w:color w:val="auto"/>
           <w:kern w:val="2"/>
           <w:sz w:val="24"/>
           <w:szCs w:val="24"/>
           <w:lang w:eastAsia="en-US"/>
           <w14:ligatures w14:val="standardContextual"/>
-        </w:rPr>
-        <w:id w:val="-1874224293"/>
-        <w:docPartObj>
-          <w:docPartGallery w:val="Table of Contents"/>
-          <w:docPartUnique/>
-        </w:docPartObj>
-      </w:sdtPr>
-      <w:sdtEndPr>
-        <w:rPr>
-          <w:b/>
-          <w:bCs/>
         </w:rPr>
       </w:sdtEndPr>
       <w:sdtContent>
@@ -215,7 +213,7 @@
             <w:pStyle w:val="Cabealhodondice"/>
           </w:pPr>
           <w:r>
-            <w:t xml:space="preserve">Índice </w:t>
+            <w:t>Conteúdo</w:t>
           </w:r>
         </w:p>
         <w:p>
@@ -239,7 +237,7 @@
           <w:r>
             <w:fldChar w:fldCharType="separate"/>
           </w:r>
-          <w:hyperlink w:anchor="_Toc243583131" w:history="1">
+          <w:hyperlink w:anchor="_Toc243660183" w:history="1">
             <w:r>
               <w:rPr>
                 <w:rStyle w:val="Hiperligao"/>
@@ -266,7 +264,7 @@
                 <w:noProof/>
                 <w:webHidden/>
               </w:rPr>
-              <w:instrText xml:space="preserve"> PAGEREF _Toc243583131 \h </w:instrText>
+              <w:instrText xml:space="preserve"> PAGEREF _Toc243660183 \h </w:instrText>
             </w:r>
             <w:r>
               <w:rPr>
@@ -286,7 +284,7 @@
                 <w:noProof/>
                 <w:webHidden/>
               </w:rPr>
-              <w:t>3</w:t>
+              <w:t>4</w:t>
             </w:r>
             <w:r>
               <w:rPr>
@@ -309,7 +307,7 @@
               <w:lang w:eastAsia="pt-PT"/>
             </w:rPr>
           </w:pPr>
-          <w:hyperlink w:anchor="_Toc243583132" w:history="1">
+          <w:hyperlink w:anchor="_Toc243660184" w:history="1">
             <w:r>
               <w:rPr>
                 <w:rStyle w:val="Hiperligao"/>
@@ -336,7 +334,7 @@
                 <w:noProof/>
                 <w:webHidden/>
               </w:rPr>
-              <w:instrText xml:space="preserve"> PAGEREF _Toc243583132 \h </w:instrText>
+              <w:instrText xml:space="preserve"> PAGEREF _Toc243660184 \h </w:instrText>
             </w:r>
             <w:r>
               <w:rPr>
@@ -379,7 +377,7 @@
               <w:lang w:eastAsia="pt-PT"/>
             </w:rPr>
           </w:pPr>
-          <w:hyperlink w:anchor="_Toc243583133" w:history="1">
+          <w:hyperlink w:anchor="_Toc243660185" w:history="1">
             <w:r>
               <w:rPr>
                 <w:rStyle w:val="Hiperligao"/>
@@ -406,7 +404,7 @@
                 <w:noProof/>
                 <w:webHidden/>
               </w:rPr>
-              <w:instrText xml:space="preserve"> PAGEREF _Toc243583133 \h </w:instrText>
+              <w:instrText xml:space="preserve"> PAGEREF _Toc243660185 \h </w:instrText>
             </w:r>
             <w:r>
               <w:rPr>
@@ -449,7 +447,7 @@
               <w:lang w:eastAsia="pt-PT"/>
             </w:rPr>
           </w:pPr>
-          <w:hyperlink w:anchor="_Toc243583134" w:history="1">
+          <w:hyperlink w:anchor="_Toc243660186" w:history="1">
             <w:r>
               <w:rPr>
                 <w:rStyle w:val="Hiperligao"/>
@@ -476,7 +474,7 @@
                 <w:noProof/>
                 <w:webHidden/>
               </w:rPr>
-              <w:instrText xml:space="preserve"> PAGEREF _Toc243583134 \h </w:instrText>
+              <w:instrText xml:space="preserve"> PAGEREF _Toc243660186 \h </w:instrText>
             </w:r>
             <w:r>
               <w:rPr>
@@ -519,7 +517,7 @@
               <w:lang w:eastAsia="pt-PT"/>
             </w:rPr>
           </w:pPr>
-          <w:hyperlink w:anchor="_Toc243583135" w:history="1">
+          <w:hyperlink w:anchor="_Toc243660187" w:history="1">
             <w:r>
               <w:rPr>
                 <w:rStyle w:val="Hiperligao"/>
@@ -546,7 +544,7 @@
                 <w:noProof/>
                 <w:webHidden/>
               </w:rPr>
-              <w:instrText xml:space="preserve"> PAGEREF _Toc243583135 \h </w:instrText>
+              <w:instrText xml:space="preserve"> PAGEREF _Toc243660187 \h </w:instrText>
             </w:r>
             <w:r>
               <w:rPr>
@@ -589,7 +587,7 @@
               <w:lang w:eastAsia="pt-PT"/>
             </w:rPr>
           </w:pPr>
-          <w:hyperlink w:anchor="_Toc243583136" w:history="1">
+          <w:hyperlink w:anchor="_Toc243660188" w:history="1">
             <w:r>
               <w:rPr>
                 <w:rStyle w:val="Hiperligao"/>
@@ -616,7 +614,7 @@
                 <w:noProof/>
                 <w:webHidden/>
               </w:rPr>
-              <w:instrText xml:space="preserve"> PAGEREF _Toc243583136 \h </w:instrText>
+              <w:instrText xml:space="preserve"> PAGEREF _Toc243660188 \h </w:instrText>
             </w:r>
             <w:r>
               <w:rPr>
@@ -659,7 +657,7 @@
               <w:lang w:eastAsia="pt-PT"/>
             </w:rPr>
           </w:pPr>
-          <w:hyperlink w:anchor="_Toc243583137" w:history="1">
+          <w:hyperlink w:anchor="_Toc243660189" w:history="1">
             <w:r>
               <w:rPr>
                 <w:rStyle w:val="Hiperligao"/>
@@ -686,7 +684,7 @@
                 <w:noProof/>
                 <w:webHidden/>
               </w:rPr>
-              <w:instrText xml:space="preserve"> PAGEREF _Toc243583137 \h </w:instrText>
+              <w:instrText xml:space="preserve"> PAGEREF _Toc243660189 \h </w:instrText>
             </w:r>
             <w:r>
               <w:rPr>
@@ -729,7 +727,7 @@
               <w:lang w:eastAsia="pt-PT"/>
             </w:rPr>
           </w:pPr>
-          <w:hyperlink w:anchor="_Toc243583138" w:history="1">
+          <w:hyperlink w:anchor="_Toc243660190" w:history="1">
             <w:r>
               <w:rPr>
                 <w:rStyle w:val="Hiperligao"/>
@@ -756,7 +754,7 @@
                 <w:noProof/>
                 <w:webHidden/>
               </w:rPr>
-              <w:instrText xml:space="preserve"> PAGEREF _Toc243583138 \h </w:instrText>
+              <w:instrText xml:space="preserve"> PAGEREF _Toc243660190 \h </w:instrText>
             </w:r>
             <w:r>
               <w:rPr>
@@ -799,7 +797,7 @@
               <w:lang w:eastAsia="pt-PT"/>
             </w:rPr>
           </w:pPr>
-          <w:hyperlink w:anchor="_Toc243583139" w:history="1">
+          <w:hyperlink w:anchor="_Toc243660191" w:history="1">
             <w:r>
               <w:rPr>
                 <w:rStyle w:val="Hiperligao"/>
@@ -826,7 +824,7 @@
                 <w:noProof/>
                 <w:webHidden/>
               </w:rPr>
-              <w:instrText xml:space="preserve"> PAGEREF _Toc243583139 \h </w:instrText>
+              <w:instrText xml:space="preserve"> PAGEREF _Toc243660191 \h </w:instrText>
             </w:r>
             <w:r>
               <w:rPr>
@@ -869,7 +867,7 @@
               <w:lang w:eastAsia="pt-PT"/>
             </w:rPr>
           </w:pPr>
-          <w:hyperlink w:anchor="_Toc243583140" w:history="1">
+          <w:hyperlink w:anchor="_Toc243660192" w:history="1">
             <w:r>
               <w:rPr>
                 <w:rStyle w:val="Hiperligao"/>
@@ -896,7 +894,7 @@
                 <w:noProof/>
                 <w:webHidden/>
               </w:rPr>
-              <w:instrText xml:space="preserve"> PAGEREF _Toc243583140 \h </w:instrText>
+              <w:instrText xml:space="preserve"> PAGEREF _Toc243660192 \h </w:instrText>
             </w:r>
             <w:r>
               <w:rPr>
@@ -939,7 +937,7 @@
               <w:lang w:eastAsia="pt-PT"/>
             </w:rPr>
           </w:pPr>
-          <w:hyperlink w:anchor="_Toc243583141" w:history="1">
+          <w:hyperlink w:anchor="_Toc243660193" w:history="1">
             <w:r>
               <w:rPr>
                 <w:rStyle w:val="Hiperligao"/>
@@ -966,7 +964,7 @@
                 <w:noProof/>
                 <w:webHidden/>
               </w:rPr>
-              <w:instrText xml:space="preserve"> PAGEREF _Toc243583141 \h </w:instrText>
+              <w:instrText xml:space="preserve"> PAGEREF _Toc243660193 \h </w:instrText>
             </w:r>
             <w:r>
               <w:rPr>
@@ -1009,7 +1007,7 @@
               <w:lang w:eastAsia="pt-PT"/>
             </w:rPr>
           </w:pPr>
-          <w:hyperlink w:anchor="_Toc243583142" w:history="1">
+          <w:hyperlink w:anchor="_Toc243660194" w:history="1">
             <w:r>
               <w:rPr>
                 <w:rStyle w:val="Hiperligao"/>
@@ -1036,7 +1034,7 @@
                 <w:noProof/>
                 <w:webHidden/>
               </w:rPr>
-              <w:instrText xml:space="preserve"> PAGEREF _Toc243583142 \h </w:instrText>
+              <w:instrText xml:space="preserve"> PAGEREF _Toc243660194 \h </w:instrText>
             </w:r>
             <w:r>
               <w:rPr>
@@ -1079,7 +1077,7 @@
               <w:lang w:eastAsia="pt-PT"/>
             </w:rPr>
           </w:pPr>
-          <w:hyperlink w:anchor="_Toc243583143" w:history="1">
+          <w:hyperlink w:anchor="_Toc243660195" w:history="1">
             <w:r>
               <w:rPr>
                 <w:rStyle w:val="Hiperligao"/>
@@ -1106,7 +1104,7 @@
                 <w:noProof/>
                 <w:webHidden/>
               </w:rPr>
-              <w:instrText xml:space="preserve"> PAGEREF _Toc243583143 \h </w:instrText>
+              <w:instrText xml:space="preserve"> PAGEREF _Toc243660195 \h </w:instrText>
             </w:r>
             <w:r>
               <w:rPr>
@@ -1149,7 +1147,7 @@
               <w:lang w:eastAsia="pt-PT"/>
             </w:rPr>
           </w:pPr>
-          <w:hyperlink w:anchor="_Toc243583144" w:history="1">
+          <w:hyperlink w:anchor="_Toc243660196" w:history="1">
             <w:r>
               <w:rPr>
                 <w:rStyle w:val="Hiperligao"/>
@@ -1176,7 +1174,7 @@
                 <w:noProof/>
                 <w:webHidden/>
               </w:rPr>
-              <w:instrText xml:space="preserve"> PAGEREF _Toc243583144 \h </w:instrText>
+              <w:instrText xml:space="preserve"> PAGEREF _Toc243660196 \h </w:instrText>
             </w:r>
             <w:r>
               <w:rPr>
@@ -1219,7 +1217,7 @@
               <w:lang w:eastAsia="pt-PT"/>
             </w:rPr>
           </w:pPr>
-          <w:hyperlink w:anchor="_Toc243583145" w:history="1">
+          <w:hyperlink w:anchor="_Toc243660197" w:history="1">
             <w:r>
               <w:rPr>
                 <w:rStyle w:val="Hiperligao"/>
@@ -1246,7 +1244,7 @@
                 <w:noProof/>
                 <w:webHidden/>
               </w:rPr>
-              <w:instrText xml:space="preserve"> PAGEREF _Toc243583145 \h </w:instrText>
+              <w:instrText xml:space="preserve"> PAGEREF _Toc243660197 \h </w:instrText>
             </w:r>
             <w:r>
               <w:rPr>
@@ -1289,7 +1287,7 @@
               <w:lang w:eastAsia="pt-PT"/>
             </w:rPr>
           </w:pPr>
-          <w:hyperlink w:anchor="_Toc243583146" w:history="1">
+          <w:hyperlink w:anchor="_Toc243660198" w:history="1">
             <w:r>
               <w:rPr>
                 <w:rStyle w:val="Hiperligao"/>
@@ -1316,7 +1314,7 @@
                 <w:noProof/>
                 <w:webHidden/>
               </w:rPr>
-              <w:instrText xml:space="preserve"> PAGEREF _Toc243583146 \h </w:instrText>
+              <w:instrText xml:space="preserve"> PAGEREF _Toc243660198 \h </w:instrText>
             </w:r>
             <w:r>
               <w:rPr>
@@ -1359,7 +1357,7 @@
               <w:lang w:eastAsia="pt-PT"/>
             </w:rPr>
           </w:pPr>
-          <w:hyperlink w:anchor="_Toc243583147" w:history="1">
+          <w:hyperlink w:anchor="_Toc243660199" w:history="1">
             <w:r>
               <w:rPr>
                 <w:rStyle w:val="Hiperligao"/>
@@ -1386,7 +1384,7 @@
                 <w:noProof/>
                 <w:webHidden/>
               </w:rPr>
-              <w:instrText xml:space="preserve"> PAGEREF _Toc243583147 \h </w:instrText>
+              <w:instrText xml:space="preserve"> PAGEREF _Toc243660199 \h </w:instrText>
             </w:r>
             <w:r>
               <w:rPr>
@@ -1429,7 +1427,7 @@
               <w:lang w:eastAsia="pt-PT"/>
             </w:rPr>
           </w:pPr>
-          <w:hyperlink w:anchor="_Toc243583148" w:history="1">
+          <w:hyperlink w:anchor="_Toc243660200" w:history="1">
             <w:r>
               <w:rPr>
                 <w:rStyle w:val="Hiperligao"/>
@@ -1456,7 +1454,7 @@
                 <w:noProof/>
                 <w:webHidden/>
               </w:rPr>
-              <w:instrText xml:space="preserve"> PAGEREF _Toc243583148 \h </w:instrText>
+              <w:instrText xml:space="preserve"> PAGEREF _Toc243660200 \h </w:instrText>
             </w:r>
             <w:r>
               <w:rPr>
@@ -1499,7 +1497,7 @@
               <w:lang w:eastAsia="pt-PT"/>
             </w:rPr>
           </w:pPr>
-          <w:hyperlink w:anchor="_Toc243583149" w:history="1">
+          <w:hyperlink w:anchor="_Toc243660201" w:history="1">
             <w:r>
               <w:rPr>
                 <w:rStyle w:val="Hiperligao"/>
@@ -1526,7 +1524,7 @@
                 <w:noProof/>
                 <w:webHidden/>
               </w:rPr>
-              <w:instrText xml:space="preserve"> PAGEREF _Toc243583149 \h </w:instrText>
+              <w:instrText xml:space="preserve"> PAGEREF _Toc243660201 \h </w:instrText>
             </w:r>
             <w:r>
               <w:rPr>
@@ -1569,7 +1567,7 @@
               <w:lang w:eastAsia="pt-PT"/>
             </w:rPr>
           </w:pPr>
-          <w:hyperlink w:anchor="_Toc243583150" w:history="1">
+          <w:hyperlink w:anchor="_Toc243660202" w:history="1">
             <w:r>
               <w:rPr>
                 <w:rStyle w:val="Hiperligao"/>
@@ -1596,7 +1594,7 @@
                 <w:noProof/>
                 <w:webHidden/>
               </w:rPr>
-              <w:instrText xml:space="preserve"> PAGEREF _Toc243583150 \h </w:instrText>
+              <w:instrText xml:space="preserve"> PAGEREF _Toc243660202 \h </w:instrText>
             </w:r>
             <w:r>
               <w:rPr>
@@ -1639,7 +1637,7 @@
               <w:lang w:eastAsia="pt-PT"/>
             </w:rPr>
           </w:pPr>
-          <w:hyperlink w:anchor="_Toc243583151" w:history="1">
+          <w:hyperlink w:anchor="_Toc243660203" w:history="1">
             <w:r>
               <w:rPr>
                 <w:rStyle w:val="Hiperligao"/>
@@ -1666,7 +1664,7 @@
                 <w:noProof/>
                 <w:webHidden/>
               </w:rPr>
-              <w:instrText xml:space="preserve"> PAGEREF _Toc243583151 \h </w:instrText>
+              <w:instrText xml:space="preserve"> PAGEREF _Toc243660203 \h </w:instrText>
             </w:r>
             <w:r>
               <w:rPr>
@@ -1709,7 +1707,7 @@
               <w:lang w:eastAsia="pt-PT"/>
             </w:rPr>
           </w:pPr>
-          <w:hyperlink w:anchor="_Toc243583152" w:history="1">
+          <w:hyperlink w:anchor="_Toc243660204" w:history="1">
             <w:r>
               <w:rPr>
                 <w:rStyle w:val="Hiperligao"/>
@@ -1736,7 +1734,7 @@
                 <w:noProof/>
                 <w:webHidden/>
               </w:rPr>
-              <w:instrText xml:space="preserve"> PAGEREF _Toc243583152 \h </w:instrText>
+              <w:instrText xml:space="preserve"> PAGEREF _Toc243660204 \h </w:instrText>
             </w:r>
             <w:r>
               <w:rPr>
@@ -1779,7 +1777,7 @@
               <w:lang w:eastAsia="pt-PT"/>
             </w:rPr>
           </w:pPr>
-          <w:hyperlink w:anchor="_Toc243583153" w:history="1">
+          <w:hyperlink w:anchor="_Toc243660205" w:history="1">
             <w:r>
               <w:rPr>
                 <w:rStyle w:val="Hiperligao"/>
@@ -1806,7 +1804,7 @@
                 <w:noProof/>
                 <w:webHidden/>
               </w:rPr>
-              <w:instrText xml:space="preserve"> PAGEREF _Toc243583153 \h </w:instrText>
+              <w:instrText xml:space="preserve"> PAGEREF _Toc243660205 \h </w:instrText>
             </w:r>
             <w:r>
               <w:rPr>
@@ -1849,7 +1847,7 @@
               <w:lang w:eastAsia="pt-PT"/>
             </w:rPr>
           </w:pPr>
-          <w:hyperlink w:anchor="_Toc243583154" w:history="1">
+          <w:hyperlink w:anchor="_Toc243660206" w:history="1">
             <w:r>
               <w:rPr>
                 <w:rStyle w:val="Hiperligao"/>
@@ -1876,7 +1874,7 @@
                 <w:noProof/>
                 <w:webHidden/>
               </w:rPr>
-              <w:instrText xml:space="preserve"> PAGEREF _Toc243583154 \h </w:instrText>
+              <w:instrText xml:space="preserve"> PAGEREF _Toc243660206 \h </w:instrText>
             </w:r>
             <w:r>
               <w:rPr>
@@ -1919,7 +1917,7 @@
               <w:lang w:eastAsia="pt-PT"/>
             </w:rPr>
           </w:pPr>
-          <w:hyperlink w:anchor="_Toc243583155" w:history="1">
+          <w:hyperlink w:anchor="_Toc243660207" w:history="1">
             <w:r>
               <w:rPr>
                 <w:rStyle w:val="Hiperligao"/>
@@ -1946,7 +1944,7 @@
                 <w:noProof/>
                 <w:webHidden/>
               </w:rPr>
-              <w:instrText xml:space="preserve"> PAGEREF _Toc243583155 \h </w:instrText>
+              <w:instrText xml:space="preserve"> PAGEREF _Toc243660207 \h </w:instrText>
             </w:r>
             <w:r>
               <w:rPr>
@@ -1989,7 +1987,7 @@
               <w:lang w:eastAsia="pt-PT"/>
             </w:rPr>
           </w:pPr>
-          <w:hyperlink w:anchor="_Toc243583156" w:history="1">
+          <w:hyperlink w:anchor="_Toc243660208" w:history="1">
             <w:r>
               <w:rPr>
                 <w:rStyle w:val="Hiperligao"/>
@@ -2016,7 +2014,7 @@
                 <w:noProof/>
                 <w:webHidden/>
               </w:rPr>
-              <w:instrText xml:space="preserve"> PAGEREF _Toc243583156 \h </w:instrText>
+              <w:instrText xml:space="preserve"> PAGEREF _Toc243660208 \h </w:instrText>
             </w:r>
             <w:r>
               <w:rPr>
@@ -2059,7 +2057,7 @@
               <w:lang w:eastAsia="pt-PT"/>
             </w:rPr>
           </w:pPr>
-          <w:hyperlink w:anchor="_Toc243583157" w:history="1">
+          <w:hyperlink w:anchor="_Toc243660209" w:history="1">
             <w:r>
               <w:rPr>
                 <w:rStyle w:val="Hiperligao"/>
@@ -2086,7 +2084,7 @@
                 <w:noProof/>
                 <w:webHidden/>
               </w:rPr>
-              <w:instrText xml:space="preserve"> PAGEREF _Toc243583157 \h </w:instrText>
+              <w:instrText xml:space="preserve"> PAGEREF _Toc243660209 \h </w:instrText>
             </w:r>
             <w:r>
               <w:rPr>
@@ -2129,7 +2127,7 @@
               <w:lang w:eastAsia="pt-PT"/>
             </w:rPr>
           </w:pPr>
-          <w:hyperlink w:anchor="_Toc243583158" w:history="1">
+          <w:hyperlink w:anchor="_Toc243660210" w:history="1">
             <w:r>
               <w:rPr>
                 <w:rStyle w:val="Hiperligao"/>
@@ -2156,7 +2154,7 @@
                 <w:noProof/>
                 <w:webHidden/>
               </w:rPr>
-              <w:instrText xml:space="preserve"> PAGEREF _Toc243583158 \h </w:instrText>
+              <w:instrText xml:space="preserve"> PAGEREF _Toc243660210 \h </w:instrText>
             </w:r>
             <w:r>
               <w:rPr>
@@ -2199,7 +2197,7 @@
               <w:lang w:eastAsia="pt-PT"/>
             </w:rPr>
           </w:pPr>
-          <w:hyperlink w:anchor="_Toc243583159" w:history="1">
+          <w:hyperlink w:anchor="_Toc243660211" w:history="1">
             <w:r>
               <w:rPr>
                 <w:rStyle w:val="Hiperligao"/>
@@ -2226,7 +2224,7 @@
                 <w:noProof/>
                 <w:webHidden/>
               </w:rPr>
-              <w:instrText xml:space="preserve"> PAGEREF _Toc243583159 \h </w:instrText>
+              <w:instrText xml:space="preserve"> PAGEREF _Toc243660211 \h </w:instrText>
             </w:r>
             <w:r>
               <w:rPr>
@@ -2269,7 +2267,7 @@
               <w:lang w:eastAsia="pt-PT"/>
             </w:rPr>
           </w:pPr>
-          <w:hyperlink w:anchor="_Toc243583160" w:history="1">
+          <w:hyperlink w:anchor="_Toc243660212" w:history="1">
             <w:r>
               <w:rPr>
                 <w:rStyle w:val="Hiperligao"/>
@@ -2296,7 +2294,7 @@
                 <w:noProof/>
                 <w:webHidden/>
               </w:rPr>
-              <w:instrText xml:space="preserve"> PAGEREF _Toc243583160 \h </w:instrText>
+              <w:instrText xml:space="preserve"> PAGEREF _Toc243660212 \h </w:instrText>
             </w:r>
             <w:r>
               <w:rPr>
@@ -2328,11 +2326,6 @@
           </w:hyperlink>
         </w:p>
         <w:p>
-          <w:pPr>
-            <w:tabs>
-              <w:tab w:val="left" w:pos="1752"/>
-            </w:tabs>
-          </w:pPr>
           <w:r>
             <w:rPr>
               <w:b/>
@@ -2340,13 +2333,6 @@
             </w:rPr>
             <w:fldChar w:fldCharType="end"/>
           </w:r>
-          <w:r>
-            <w:rPr>
-              <w:b/>
-              <w:bCs/>
-            </w:rPr>
-            <w:tab/>
-          </w:r>
         </w:p>
       </w:sdtContent>
     </w:sdt>
@@ -2379,7 +2365,6 @@
     </w:p>
     <w:p>
       <w:pPr>
-        <w:jc w:val="center"/>
         <w:rPr>
           <w:sz w:val="22"/>
           <w:szCs w:val="22"/>
@@ -2388,11 +2373,15 @@
     </w:p>
     <w:p>
       <w:pPr>
-        <w:jc w:val="center"/>
-        <w:rPr>
-          <w:sz w:val="22"/>
-          <w:szCs w:val="22"/>
-        </w:rPr>
+        <w:pStyle w:val="SemEspaamento"/>
+      </w:pPr>
+      <w:r>
+        <w:t xml:space="preserve">Índice de Tabelas </w:t>
+      </w:r>
+    </w:p>
+    <w:p>
+      <w:pPr>
+        <w:pStyle w:val="SemEspaamento"/>
       </w:pPr>
     </w:p>
     <w:p>
@@ -3318,7 +3307,6 @@
     </w:p>
     <w:p>
       <w:pPr>
-        <w:jc w:val="center"/>
         <w:rPr>
           <w:sz w:val="22"/>
           <w:szCs w:val="22"/>
@@ -3334,48 +3322,1019 @@
     </w:p>
     <w:p>
       <w:pPr>
-        <w:jc w:val="center"/>
         <w:rPr>
           <w:sz w:val="22"/>
           <w:szCs w:val="22"/>
         </w:rPr>
       </w:pPr>
-    </w:p>
-    <w:p>
-      <w:pPr>
-        <w:jc w:val="center"/>
+      <w:r>
         <w:rPr>
           <w:sz w:val="22"/>
           <w:szCs w:val="22"/>
         </w:rPr>
-      </w:pPr>
-    </w:p>
-    <w:p>
-      <w:pPr>
-        <w:jc w:val="center"/>
+        <w:t>Índice de figuras</w:t>
+      </w:r>
+    </w:p>
+    <w:p>
+      <w:pPr>
+        <w:pStyle w:val="ndicedeilustraes"/>
+        <w:tabs>
+          <w:tab w:val="right" w:leader="dot" w:pos="8494"/>
+        </w:tabs>
+        <w:rPr>
+          <w:rFonts w:eastAsiaTheme="minorEastAsia"/>
+          <w:noProof/>
+          <w:lang w:eastAsia="pt-PT"/>
+        </w:rPr>
+      </w:pPr>
+      <w:r>
         <w:rPr>
           <w:sz w:val="22"/>
           <w:szCs w:val="22"/>
         </w:rPr>
-      </w:pPr>
-    </w:p>
-    <w:p>
-      <w:pPr>
-        <w:jc w:val="center"/>
+        <w:fldChar w:fldCharType="begin"/>
+      </w:r>
+      <w:r>
         <w:rPr>
           <w:sz w:val="22"/>
           <w:szCs w:val="22"/>
         </w:rPr>
-      </w:pPr>
-    </w:p>
-    <w:p>
-      <w:pPr>
-        <w:jc w:val="center"/>
+        <w:instrText xml:space="preserve"> TOC \h \z \c "Figura" </w:instrText>
+      </w:r>
+      <w:r>
         <w:rPr>
           <w:sz w:val="22"/>
           <w:szCs w:val="22"/>
         </w:rPr>
-      </w:pPr>
+        <w:fldChar w:fldCharType="separate"/>
+      </w:r>
+      <w:hyperlink w:anchor="_Toc243660221" w:history="1">
+        <w:r>
+          <w:rPr>
+            <w:rStyle w:val="Hiperligao"/>
+            <w:noProof/>
+          </w:rPr>
+          <w:t>Figura 1– Transformação 02_join_transfers_appearances no Spoon</w:t>
+        </w:r>
+        <w:r>
+          <w:rPr>
+            <w:noProof/>
+            <w:webHidden/>
+          </w:rPr>
+          <w:tab/>
+        </w:r>
+        <w:r>
+          <w:rPr>
+            <w:noProof/>
+            <w:webHidden/>
+          </w:rPr>
+          <w:fldChar w:fldCharType="begin"/>
+        </w:r>
+        <w:r>
+          <w:rPr>
+            <w:noProof/>
+            <w:webHidden/>
+          </w:rPr>
+          <w:instrText xml:space="preserve"> PAGEREF _Toc243660221 \h </w:instrText>
+        </w:r>
+        <w:r>
+          <w:rPr>
+            <w:noProof/>
+            <w:webHidden/>
+          </w:rPr>
+        </w:r>
+        <w:r>
+          <w:rPr>
+            <w:noProof/>
+            <w:webHidden/>
+          </w:rPr>
+          <w:fldChar w:fldCharType="separate"/>
+        </w:r>
+        <w:r>
+          <w:rPr>
+            <w:noProof/>
+            <w:webHidden/>
+          </w:rPr>
+          <w:t>9</w:t>
+        </w:r>
+        <w:r>
+          <w:rPr>
+            <w:noProof/>
+            <w:webHidden/>
+          </w:rPr>
+          <w:fldChar w:fldCharType="end"/>
+        </w:r>
+      </w:hyperlink>
+    </w:p>
+    <w:p>
+      <w:pPr>
+        <w:pStyle w:val="ndicedeilustraes"/>
+        <w:tabs>
+          <w:tab w:val="right" w:leader="dot" w:pos="8494"/>
+        </w:tabs>
+        <w:rPr>
+          <w:rFonts w:eastAsiaTheme="minorEastAsia"/>
+          <w:noProof/>
+          <w:lang w:eastAsia="pt-PT"/>
+        </w:rPr>
+      </w:pPr>
+      <w:hyperlink w:anchor="_Toc243660222" w:history="1">
+        <w:r>
+          <w:rPr>
+            <w:rStyle w:val="Hiperligao"/>
+            <w:noProof/>
+          </w:rPr>
+          <w:t>Figura 2– Linhas lidas e escritas por passo</w:t>
+        </w:r>
+        <w:r>
+          <w:rPr>
+            <w:noProof/>
+            <w:webHidden/>
+          </w:rPr>
+          <w:tab/>
+        </w:r>
+        <w:r>
+          <w:rPr>
+            <w:noProof/>
+            <w:webHidden/>
+          </w:rPr>
+          <w:fldChar w:fldCharType="begin"/>
+        </w:r>
+        <w:r>
+          <w:rPr>
+            <w:noProof/>
+            <w:webHidden/>
+          </w:rPr>
+          <w:instrText xml:space="preserve"> PAGEREF _Toc243660222 \h </w:instrText>
+        </w:r>
+        <w:r>
+          <w:rPr>
+            <w:noProof/>
+            <w:webHidden/>
+          </w:rPr>
+        </w:r>
+        <w:r>
+          <w:rPr>
+            <w:noProof/>
+            <w:webHidden/>
+          </w:rPr>
+          <w:fldChar w:fldCharType="separate"/>
+        </w:r>
+        <w:r>
+          <w:rPr>
+            <w:noProof/>
+            <w:webHidden/>
+          </w:rPr>
+          <w:t>10</w:t>
+        </w:r>
+        <w:r>
+          <w:rPr>
+            <w:noProof/>
+            <w:webHidden/>
+          </w:rPr>
+          <w:fldChar w:fldCharType="end"/>
+        </w:r>
+      </w:hyperlink>
+    </w:p>
+    <w:p>
+      <w:pPr>
+        <w:pStyle w:val="ndicedeilustraes"/>
+        <w:tabs>
+          <w:tab w:val="right" w:leader="dot" w:pos="8494"/>
+        </w:tabs>
+        <w:rPr>
+          <w:rFonts w:eastAsiaTheme="minorEastAsia"/>
+          <w:noProof/>
+          <w:lang w:eastAsia="pt-PT"/>
+        </w:rPr>
+      </w:pPr>
+      <w:hyperlink w:anchor="_Toc243660223" w:history="1">
+        <w:r>
+          <w:rPr>
+            <w:rStyle w:val="Hiperligao"/>
+            <w:noProof/>
+          </w:rPr>
+          <w:t>Figura 3– Resultado da transformação 02</w:t>
+        </w:r>
+        <w:r>
+          <w:rPr>
+            <w:noProof/>
+            <w:webHidden/>
+          </w:rPr>
+          <w:tab/>
+        </w:r>
+        <w:r>
+          <w:rPr>
+            <w:noProof/>
+            <w:webHidden/>
+          </w:rPr>
+          <w:fldChar w:fldCharType="begin"/>
+        </w:r>
+        <w:r>
+          <w:rPr>
+            <w:noProof/>
+            <w:webHidden/>
+          </w:rPr>
+          <w:instrText xml:space="preserve"> PAGEREF _Toc243660223 \h </w:instrText>
+        </w:r>
+        <w:r>
+          <w:rPr>
+            <w:noProof/>
+            <w:webHidden/>
+          </w:rPr>
+        </w:r>
+        <w:r>
+          <w:rPr>
+            <w:noProof/>
+            <w:webHidden/>
+          </w:rPr>
+          <w:fldChar w:fldCharType="separate"/>
+        </w:r>
+        <w:r>
+          <w:rPr>
+            <w:noProof/>
+            <w:webHidden/>
+          </w:rPr>
+          <w:t>11</w:t>
+        </w:r>
+        <w:r>
+          <w:rPr>
+            <w:noProof/>
+            <w:webHidden/>
+          </w:rPr>
+          <w:fldChar w:fldCharType="end"/>
+        </w:r>
+      </w:hyperlink>
+    </w:p>
+    <w:p>
+      <w:pPr>
+        <w:pStyle w:val="ndicedeilustraes"/>
+        <w:tabs>
+          <w:tab w:val="right" w:leader="dot" w:pos="8494"/>
+        </w:tabs>
+        <w:rPr>
+          <w:rFonts w:eastAsiaTheme="minorEastAsia"/>
+          <w:noProof/>
+          <w:lang w:eastAsia="pt-PT"/>
+        </w:rPr>
+      </w:pPr>
+      <w:hyperlink w:anchor="_Toc243660224" w:history="1">
+        <w:r>
+          <w:rPr>
+            <w:rStyle w:val="Hiperligao"/>
+            <w:noProof/>
+          </w:rPr>
+          <w:t>Figura 4– Transformação 03_enriquecer_ligas no Spoon</w:t>
+        </w:r>
+        <w:r>
+          <w:rPr>
+            <w:noProof/>
+            <w:webHidden/>
+          </w:rPr>
+          <w:tab/>
+        </w:r>
+        <w:r>
+          <w:rPr>
+            <w:noProof/>
+            <w:webHidden/>
+          </w:rPr>
+          <w:fldChar w:fldCharType="begin"/>
+        </w:r>
+        <w:r>
+          <w:rPr>
+            <w:noProof/>
+            <w:webHidden/>
+          </w:rPr>
+          <w:instrText xml:space="preserve"> PAGEREF _Toc243660224 \h </w:instrText>
+        </w:r>
+        <w:r>
+          <w:rPr>
+            <w:noProof/>
+            <w:webHidden/>
+          </w:rPr>
+        </w:r>
+        <w:r>
+          <w:rPr>
+            <w:noProof/>
+            <w:webHidden/>
+          </w:rPr>
+          <w:fldChar w:fldCharType="separate"/>
+        </w:r>
+        <w:r>
+          <w:rPr>
+            <w:noProof/>
+            <w:webHidden/>
+          </w:rPr>
+          <w:t>12</w:t>
+        </w:r>
+        <w:r>
+          <w:rPr>
+            <w:noProof/>
+            <w:webHidden/>
+          </w:rPr>
+          <w:fldChar w:fldCharType="end"/>
+        </w:r>
+      </w:hyperlink>
+    </w:p>
+    <w:p>
+      <w:pPr>
+        <w:pStyle w:val="ndicedeilustraes"/>
+        <w:tabs>
+          <w:tab w:val="right" w:leader="dot" w:pos="8494"/>
+        </w:tabs>
+        <w:rPr>
+          <w:rFonts w:eastAsiaTheme="minorEastAsia"/>
+          <w:noProof/>
+          <w:lang w:eastAsia="pt-PT"/>
+        </w:rPr>
+      </w:pPr>
+      <w:hyperlink w:anchor="_Toc243660225" w:history="1">
+        <w:r>
+          <w:rPr>
+            <w:rStyle w:val="Hiperligao"/>
+            <w:noProof/>
+          </w:rPr>
+          <w:t>Figura 5– Dados do XML antes da limpeza</w:t>
+        </w:r>
+        <w:r>
+          <w:rPr>
+            <w:noProof/>
+            <w:webHidden/>
+          </w:rPr>
+          <w:tab/>
+        </w:r>
+        <w:r>
+          <w:rPr>
+            <w:noProof/>
+            <w:webHidden/>
+          </w:rPr>
+          <w:fldChar w:fldCharType="begin"/>
+        </w:r>
+        <w:r>
+          <w:rPr>
+            <w:noProof/>
+            <w:webHidden/>
+          </w:rPr>
+          <w:instrText xml:space="preserve"> PAGEREF _Toc243660225 \h </w:instrText>
+        </w:r>
+        <w:r>
+          <w:rPr>
+            <w:noProof/>
+            <w:webHidden/>
+          </w:rPr>
+        </w:r>
+        <w:r>
+          <w:rPr>
+            <w:noProof/>
+            <w:webHidden/>
+          </w:rPr>
+          <w:fldChar w:fldCharType="separate"/>
+        </w:r>
+        <w:r>
+          <w:rPr>
+            <w:noProof/>
+            <w:webHidden/>
+          </w:rPr>
+          <w:t>13</w:t>
+        </w:r>
+        <w:r>
+          <w:rPr>
+            <w:noProof/>
+            <w:webHidden/>
+          </w:rPr>
+          <w:fldChar w:fldCharType="end"/>
+        </w:r>
+      </w:hyperlink>
+    </w:p>
+    <w:p>
+      <w:pPr>
+        <w:pStyle w:val="ndicedeilustraes"/>
+        <w:tabs>
+          <w:tab w:val="right" w:leader="dot" w:pos="8494"/>
+        </w:tabs>
+        <w:rPr>
+          <w:rFonts w:eastAsiaTheme="minorEastAsia"/>
+          <w:noProof/>
+          <w:lang w:eastAsia="pt-PT"/>
+        </w:rPr>
+      </w:pPr>
+      <w:hyperlink w:anchor="_Toc243660226" w:history="1">
+        <w:r>
+          <w:rPr>
+            <w:rStyle w:val="Hiperligao"/>
+            <w:noProof/>
+          </w:rPr>
+          <w:t>Figura 6– Dados do XML depois da limpeza</w:t>
+        </w:r>
+        <w:r>
+          <w:rPr>
+            <w:noProof/>
+            <w:webHidden/>
+          </w:rPr>
+          <w:tab/>
+        </w:r>
+        <w:r>
+          <w:rPr>
+            <w:noProof/>
+            <w:webHidden/>
+          </w:rPr>
+          <w:fldChar w:fldCharType="begin"/>
+        </w:r>
+        <w:r>
+          <w:rPr>
+            <w:noProof/>
+            <w:webHidden/>
+          </w:rPr>
+          <w:instrText xml:space="preserve"> PAGEREF _Toc243660226 \h </w:instrText>
+        </w:r>
+        <w:r>
+          <w:rPr>
+            <w:noProof/>
+            <w:webHidden/>
+          </w:rPr>
+        </w:r>
+        <w:r>
+          <w:rPr>
+            <w:noProof/>
+            <w:webHidden/>
+          </w:rPr>
+          <w:fldChar w:fldCharType="separate"/>
+        </w:r>
+        <w:r>
+          <w:rPr>
+            <w:noProof/>
+            <w:webHidden/>
+          </w:rPr>
+          <w:t>13</w:t>
+        </w:r>
+        <w:r>
+          <w:rPr>
+            <w:noProof/>
+            <w:webHidden/>
+          </w:rPr>
+          <w:fldChar w:fldCharType="end"/>
+        </w:r>
+      </w:hyperlink>
+    </w:p>
+    <w:p>
+      <w:pPr>
+        <w:pStyle w:val="ndicedeilustraes"/>
+        <w:tabs>
+          <w:tab w:val="right" w:leader="dot" w:pos="8494"/>
+        </w:tabs>
+        <w:rPr>
+          <w:rFonts w:eastAsiaTheme="minorEastAsia"/>
+          <w:noProof/>
+          <w:lang w:eastAsia="pt-PT"/>
+        </w:rPr>
+      </w:pPr>
+      <w:hyperlink w:anchor="_Toc243660227" w:history="1">
+        <w:r>
+          <w:rPr>
+            <w:rStyle w:val="Hiperligao"/>
+            <w:noProof/>
+          </w:rPr>
+          <w:t>Figura 7– Passo de classificação</w:t>
+        </w:r>
+        <w:r>
+          <w:rPr>
+            <w:noProof/>
+            <w:webHidden/>
+          </w:rPr>
+          <w:tab/>
+        </w:r>
+        <w:r>
+          <w:rPr>
+            <w:noProof/>
+            <w:webHidden/>
+          </w:rPr>
+          <w:fldChar w:fldCharType="begin"/>
+        </w:r>
+        <w:r>
+          <w:rPr>
+            <w:noProof/>
+            <w:webHidden/>
+          </w:rPr>
+          <w:instrText xml:space="preserve"> PAGEREF _Toc243660227 \h </w:instrText>
+        </w:r>
+        <w:r>
+          <w:rPr>
+            <w:noProof/>
+            <w:webHidden/>
+          </w:rPr>
+        </w:r>
+        <w:r>
+          <w:rPr>
+            <w:noProof/>
+            <w:webHidden/>
+          </w:rPr>
+          <w:fldChar w:fldCharType="separate"/>
+        </w:r>
+        <w:r>
+          <w:rPr>
+            <w:noProof/>
+            <w:webHidden/>
+          </w:rPr>
+          <w:t>14</w:t>
+        </w:r>
+        <w:r>
+          <w:rPr>
+            <w:noProof/>
+            <w:webHidden/>
+          </w:rPr>
+          <w:fldChar w:fldCharType="end"/>
+        </w:r>
+      </w:hyperlink>
+    </w:p>
+    <w:p>
+      <w:pPr>
+        <w:pStyle w:val="ndicedeilustraes"/>
+        <w:tabs>
+          <w:tab w:val="right" w:leader="dot" w:pos="8494"/>
+        </w:tabs>
+        <w:rPr>
+          <w:rFonts w:eastAsiaTheme="minorEastAsia"/>
+          <w:noProof/>
+          <w:lang w:eastAsia="pt-PT"/>
+        </w:rPr>
+      </w:pPr>
+      <w:hyperlink w:anchor="_Toc243660228" w:history="1">
+        <w:r>
+          <w:rPr>
+            <w:rStyle w:val="Hiperligao"/>
+            <w:noProof/>
+          </w:rPr>
+          <w:t>Figura 8–  Codigo para a classificação</w:t>
+        </w:r>
+        <w:r>
+          <w:rPr>
+            <w:noProof/>
+            <w:webHidden/>
+          </w:rPr>
+          <w:tab/>
+        </w:r>
+        <w:r>
+          <w:rPr>
+            <w:noProof/>
+            <w:webHidden/>
+          </w:rPr>
+          <w:fldChar w:fldCharType="begin"/>
+        </w:r>
+        <w:r>
+          <w:rPr>
+            <w:noProof/>
+            <w:webHidden/>
+          </w:rPr>
+          <w:instrText xml:space="preserve"> PAGEREF _Toc243660228 \h </w:instrText>
+        </w:r>
+        <w:r>
+          <w:rPr>
+            <w:noProof/>
+            <w:webHidden/>
+          </w:rPr>
+        </w:r>
+        <w:r>
+          <w:rPr>
+            <w:noProof/>
+            <w:webHidden/>
+          </w:rPr>
+          <w:fldChar w:fldCharType="separate"/>
+        </w:r>
+        <w:r>
+          <w:rPr>
+            <w:noProof/>
+            <w:webHidden/>
+          </w:rPr>
+          <w:t>14</w:t>
+        </w:r>
+        <w:r>
+          <w:rPr>
+            <w:noProof/>
+            <w:webHidden/>
+          </w:rPr>
+          <w:fldChar w:fldCharType="end"/>
+        </w:r>
+      </w:hyperlink>
+    </w:p>
+    <w:p>
+      <w:pPr>
+        <w:pStyle w:val="ndicedeilustraes"/>
+        <w:tabs>
+          <w:tab w:val="right" w:leader="dot" w:pos="8494"/>
+        </w:tabs>
+        <w:rPr>
+          <w:rFonts w:eastAsiaTheme="minorEastAsia"/>
+          <w:noProof/>
+          <w:lang w:eastAsia="pt-PT"/>
+        </w:rPr>
+      </w:pPr>
+      <w:hyperlink w:anchor="_Toc243660229" w:history="1">
+        <w:r>
+          <w:rPr>
+            <w:rStyle w:val="Hiperligao"/>
+            <w:noProof/>
+          </w:rPr>
+          <w:t>Figura 9– Resultado da transformação 03</w:t>
+        </w:r>
+        <w:r>
+          <w:rPr>
+            <w:noProof/>
+            <w:webHidden/>
+          </w:rPr>
+          <w:tab/>
+        </w:r>
+        <w:r>
+          <w:rPr>
+            <w:noProof/>
+            <w:webHidden/>
+          </w:rPr>
+          <w:fldChar w:fldCharType="begin"/>
+        </w:r>
+        <w:r>
+          <w:rPr>
+            <w:noProof/>
+            <w:webHidden/>
+          </w:rPr>
+          <w:instrText xml:space="preserve"> PAGEREF _Toc243660229 \h </w:instrText>
+        </w:r>
+        <w:r>
+          <w:rPr>
+            <w:noProof/>
+            <w:webHidden/>
+          </w:rPr>
+        </w:r>
+        <w:r>
+          <w:rPr>
+            <w:noProof/>
+            <w:webHidden/>
+          </w:rPr>
+          <w:fldChar w:fldCharType="separate"/>
+        </w:r>
+        <w:r>
+          <w:rPr>
+            <w:noProof/>
+            <w:webHidden/>
+          </w:rPr>
+          <w:t>15</w:t>
+        </w:r>
+        <w:r>
+          <w:rPr>
+            <w:noProof/>
+            <w:webHidden/>
+          </w:rPr>
+          <w:fldChar w:fldCharType="end"/>
+        </w:r>
+      </w:hyperlink>
+    </w:p>
+    <w:p>
+      <w:pPr>
+        <w:pStyle w:val="ndicedeilustraes"/>
+        <w:tabs>
+          <w:tab w:val="right" w:leader="dot" w:pos="8494"/>
+        </w:tabs>
+        <w:rPr>
+          <w:rFonts w:eastAsiaTheme="minorEastAsia"/>
+          <w:noProof/>
+          <w:lang w:eastAsia="pt-PT"/>
+        </w:rPr>
+      </w:pPr>
+      <w:hyperlink w:anchor="_Toc243660230" w:history="1">
+        <w:r>
+          <w:rPr>
+            <w:rStyle w:val="Hiperligao"/>
+            <w:noProof/>
+          </w:rPr>
+          <w:t>Figura 10– Tabela carregada no MySQL Workbench</w:t>
+        </w:r>
+        <w:r>
+          <w:rPr>
+            <w:noProof/>
+            <w:webHidden/>
+          </w:rPr>
+          <w:tab/>
+        </w:r>
+        <w:r>
+          <w:rPr>
+            <w:noProof/>
+            <w:webHidden/>
+          </w:rPr>
+          <w:fldChar w:fldCharType="begin"/>
+        </w:r>
+        <w:r>
+          <w:rPr>
+            <w:noProof/>
+            <w:webHidden/>
+          </w:rPr>
+          <w:instrText xml:space="preserve"> PAGEREF _Toc243660230 \h </w:instrText>
+        </w:r>
+        <w:r>
+          <w:rPr>
+            <w:noProof/>
+            <w:webHidden/>
+          </w:rPr>
+        </w:r>
+        <w:r>
+          <w:rPr>
+            <w:noProof/>
+            <w:webHidden/>
+          </w:rPr>
+          <w:fldChar w:fldCharType="separate"/>
+        </w:r>
+        <w:r>
+          <w:rPr>
+            <w:noProof/>
+            <w:webHidden/>
+          </w:rPr>
+          <w:t>15</w:t>
+        </w:r>
+        <w:r>
+          <w:rPr>
+            <w:noProof/>
+            <w:webHidden/>
+          </w:rPr>
+          <w:fldChar w:fldCharType="end"/>
+        </w:r>
+      </w:hyperlink>
+    </w:p>
+    <w:p>
+      <w:pPr>
+        <w:pStyle w:val="ndicedeilustraes"/>
+        <w:tabs>
+          <w:tab w:val="right" w:leader="dot" w:pos="8494"/>
+        </w:tabs>
+        <w:rPr>
+          <w:rFonts w:eastAsiaTheme="minorEastAsia"/>
+          <w:noProof/>
+          <w:lang w:eastAsia="pt-PT"/>
+        </w:rPr>
+      </w:pPr>
+      <w:hyperlink w:anchor="_Toc243660231" w:history="1">
+        <w:r>
+          <w:rPr>
+            <w:rStyle w:val="Hiperligao"/>
+            <w:noProof/>
+          </w:rPr>
+          <w:t>Figura 11– Job principal no Spoon</w:t>
+        </w:r>
+        <w:r>
+          <w:rPr>
+            <w:noProof/>
+            <w:webHidden/>
+          </w:rPr>
+          <w:tab/>
+        </w:r>
+        <w:r>
+          <w:rPr>
+            <w:noProof/>
+            <w:webHidden/>
+          </w:rPr>
+          <w:fldChar w:fldCharType="begin"/>
+        </w:r>
+        <w:r>
+          <w:rPr>
+            <w:noProof/>
+            <w:webHidden/>
+          </w:rPr>
+          <w:instrText xml:space="preserve"> PAGEREF _Toc243660231 \h </w:instrText>
+        </w:r>
+        <w:r>
+          <w:rPr>
+            <w:noProof/>
+            <w:webHidden/>
+          </w:rPr>
+        </w:r>
+        <w:r>
+          <w:rPr>
+            <w:noProof/>
+            <w:webHidden/>
+          </w:rPr>
+          <w:fldChar w:fldCharType="separate"/>
+        </w:r>
+        <w:r>
+          <w:rPr>
+            <w:noProof/>
+            <w:webHidden/>
+          </w:rPr>
+          <w:t>16</w:t>
+        </w:r>
+        <w:r>
+          <w:rPr>
+            <w:noProof/>
+            <w:webHidden/>
+          </w:rPr>
+          <w:fldChar w:fldCharType="end"/>
+        </w:r>
+      </w:hyperlink>
+    </w:p>
+    <w:p>
+      <w:pPr>
+        <w:pStyle w:val="ndicedeilustraes"/>
+        <w:tabs>
+          <w:tab w:val="right" w:leader="dot" w:pos="8494"/>
+        </w:tabs>
+        <w:rPr>
+          <w:rFonts w:eastAsiaTheme="minorEastAsia"/>
+          <w:noProof/>
+          <w:lang w:eastAsia="pt-PT"/>
+        </w:rPr>
+      </w:pPr>
+      <w:hyperlink w:anchor="_Toc243660232" w:history="1">
+        <w:r>
+          <w:rPr>
+            <w:rStyle w:val="Hiperligao"/>
+            <w:noProof/>
+          </w:rPr>
+          <w:t>Figura 12– Email enviado pelo job</w:t>
+        </w:r>
+        <w:r>
+          <w:rPr>
+            <w:noProof/>
+            <w:webHidden/>
+          </w:rPr>
+          <w:tab/>
+        </w:r>
+        <w:r>
+          <w:rPr>
+            <w:noProof/>
+            <w:webHidden/>
+          </w:rPr>
+          <w:fldChar w:fldCharType="begin"/>
+        </w:r>
+        <w:r>
+          <w:rPr>
+            <w:noProof/>
+            <w:webHidden/>
+          </w:rPr>
+          <w:instrText xml:space="preserve"> PAGEREF _Toc243660232 \h </w:instrText>
+        </w:r>
+        <w:r>
+          <w:rPr>
+            <w:noProof/>
+            <w:webHidden/>
+          </w:rPr>
+        </w:r>
+        <w:r>
+          <w:rPr>
+            <w:noProof/>
+            <w:webHidden/>
+          </w:rPr>
+          <w:fldChar w:fldCharType="separate"/>
+        </w:r>
+        <w:r>
+          <w:rPr>
+            <w:noProof/>
+            <w:webHidden/>
+          </w:rPr>
+          <w:t>17</w:t>
+        </w:r>
+        <w:r>
+          <w:rPr>
+            <w:noProof/>
+            <w:webHidden/>
+          </w:rPr>
+          <w:fldChar w:fldCharType="end"/>
+        </w:r>
+      </w:hyperlink>
+    </w:p>
+    <w:p>
+      <w:pPr>
+        <w:pStyle w:val="ndicedeilustraes"/>
+        <w:tabs>
+          <w:tab w:val="right" w:leader="dot" w:pos="8494"/>
+        </w:tabs>
+        <w:rPr>
+          <w:rFonts w:eastAsiaTheme="minorEastAsia"/>
+          <w:noProof/>
+          <w:lang w:eastAsia="pt-PT"/>
+        </w:rPr>
+      </w:pPr>
+      <w:hyperlink w:anchor="_Toc243660233" w:history="1">
+        <w:r>
+          <w:rPr>
+            <w:rStyle w:val="Hiperligao"/>
+            <w:noProof/>
+          </w:rPr>
+          <w:t>Figura 13– Execução do job</w:t>
+        </w:r>
+        <w:r>
+          <w:rPr>
+            <w:noProof/>
+            <w:webHidden/>
+          </w:rPr>
+          <w:tab/>
+        </w:r>
+        <w:r>
+          <w:rPr>
+            <w:noProof/>
+            <w:webHidden/>
+          </w:rPr>
+          <w:fldChar w:fldCharType="begin"/>
+        </w:r>
+        <w:r>
+          <w:rPr>
+            <w:noProof/>
+            <w:webHidden/>
+          </w:rPr>
+          <w:instrText xml:space="preserve"> PAGEREF _Toc243660233 \h </w:instrText>
+        </w:r>
+        <w:r>
+          <w:rPr>
+            <w:noProof/>
+            <w:webHidden/>
+          </w:rPr>
+        </w:r>
+        <w:r>
+          <w:rPr>
+            <w:noProof/>
+            <w:webHidden/>
+          </w:rPr>
+          <w:fldChar w:fldCharType="separate"/>
+        </w:r>
+        <w:r>
+          <w:rPr>
+            <w:noProof/>
+            <w:webHidden/>
+          </w:rPr>
+          <w:t>18</w:t>
+        </w:r>
+        <w:r>
+          <w:rPr>
+            <w:noProof/>
+            <w:webHidden/>
+          </w:rPr>
+          <w:fldChar w:fldCharType="end"/>
+        </w:r>
+      </w:hyperlink>
+    </w:p>
+    <w:p>
+      <w:pPr>
+        <w:pStyle w:val="ndicedeilustraes"/>
+        <w:tabs>
+          <w:tab w:val="right" w:leader="dot" w:pos="8494"/>
+        </w:tabs>
+        <w:rPr>
+          <w:rFonts w:eastAsiaTheme="minorEastAsia"/>
+          <w:noProof/>
+          <w:lang w:eastAsia="pt-PT"/>
+        </w:rPr>
+      </w:pPr>
+      <w:hyperlink w:anchor="_Toc243660234" w:history="1">
+        <w:r>
+          <w:rPr>
+            <w:rStyle w:val="Hiperligao"/>
+            <w:noProof/>
+          </w:rPr>
+          <w:t>Figura 14– Dashboard no Power BI</w:t>
+        </w:r>
+        <w:r>
+          <w:rPr>
+            <w:noProof/>
+            <w:webHidden/>
+          </w:rPr>
+          <w:tab/>
+        </w:r>
+        <w:r>
+          <w:rPr>
+            <w:noProof/>
+            <w:webHidden/>
+          </w:rPr>
+          <w:fldChar w:fldCharType="begin"/>
+        </w:r>
+        <w:r>
+          <w:rPr>
+            <w:noProof/>
+            <w:webHidden/>
+          </w:rPr>
+          <w:instrText xml:space="preserve"> PAGEREF _Toc243660234 \h </w:instrText>
+        </w:r>
+        <w:r>
+          <w:rPr>
+            <w:noProof/>
+            <w:webHidden/>
+          </w:rPr>
+        </w:r>
+        <w:r>
+          <w:rPr>
+            <w:noProof/>
+            <w:webHidden/>
+          </w:rPr>
+          <w:fldChar w:fldCharType="separate"/>
+        </w:r>
+        <w:r>
+          <w:rPr>
+            <w:noProof/>
+            <w:webHidden/>
+          </w:rPr>
+          <w:t>19</w:t>
+        </w:r>
+        <w:r>
+          <w:rPr>
+            <w:noProof/>
+            <w:webHidden/>
+          </w:rPr>
+          <w:fldChar w:fldCharType="end"/>
+        </w:r>
+      </w:hyperlink>
     </w:p>
     <w:p>
       <w:pPr>
@@ -3385,50 +4344,13 @@
           <w:szCs w:val="22"/>
         </w:rPr>
       </w:pPr>
-    </w:p>
-    <w:p>
-      <w:pPr>
-        <w:jc w:val="center"/>
+      <w:r>
         <w:rPr>
           <w:sz w:val="22"/>
           <w:szCs w:val="22"/>
         </w:rPr>
-      </w:pPr>
-    </w:p>
-    <w:p>
-      <w:pPr>
-        <w:jc w:val="center"/>
-        <w:rPr>
-          <w:sz w:val="22"/>
-          <w:szCs w:val="22"/>
-        </w:rPr>
-      </w:pPr>
-    </w:p>
-    <w:p>
-      <w:pPr>
-        <w:jc w:val="center"/>
-        <w:rPr>
-          <w:sz w:val="22"/>
-          <w:szCs w:val="22"/>
-        </w:rPr>
-      </w:pPr>
-    </w:p>
-    <w:p>
-      <w:pPr>
-        <w:jc w:val="center"/>
-        <w:rPr>
-          <w:sz w:val="22"/>
-          <w:szCs w:val="22"/>
-        </w:rPr>
-      </w:pPr>
-    </w:p>
-    <w:p>
-      <w:pPr>
-        <w:rPr>
-          <w:sz w:val="22"/>
-          <w:szCs w:val="22"/>
-        </w:rPr>
-      </w:pPr>
+        <w:fldChar w:fldCharType="end"/>
+      </w:r>
     </w:p>
     <w:p>
       <w:pPr>
@@ -3439,7 +4361,7 @@
           <w:szCs w:val="36"/>
         </w:rPr>
       </w:pPr>
-      <w:bookmarkStart w:id="0" w:name="_Toc243583131"/>
+      <w:bookmarkStart w:id="0" w:name="_Toc243660183"/>
       <w:r>
         <w:rPr>
           <w:color w:val="auto"/>
@@ -3708,7 +4630,7 @@
           <w:szCs w:val="28"/>
         </w:rPr>
       </w:pPr>
-      <w:bookmarkStart w:id="1" w:name="_Toc243583132"/>
+      <w:bookmarkStart w:id="1" w:name="_Toc243660184"/>
       <w:r>
         <w:rPr>
           <w:color w:val="auto"/>
@@ -4063,7 +4985,7 @@
         </w:rPr>
       </w:pPr>
       <w:bookmarkStart w:id="3" w:name="_Toc243065684"/>
-      <w:bookmarkStart w:id="4" w:name="_Toc243583133"/>
+      <w:bookmarkStart w:id="4" w:name="_Toc243660185"/>
       <w:r>
         <w:rPr>
           <w:color w:val="auto"/>
@@ -4344,7 +5266,7 @@
           <w:color w:val="auto"/>
         </w:rPr>
       </w:pPr>
-      <w:bookmarkStart w:id="5" w:name="_Toc243583134"/>
+      <w:bookmarkStart w:id="5" w:name="_Toc243660186"/>
       <w:r>
         <w:rPr>
           <w:color w:val="auto"/>
@@ -4373,7 +5295,7 @@
           <w:color w:val="auto"/>
         </w:rPr>
       </w:pPr>
-      <w:bookmarkStart w:id="6" w:name="_Toc243583135"/>
+      <w:bookmarkStart w:id="6" w:name="_Toc243660187"/>
       <w:r>
         <w:rPr>
           <w:color w:val="auto"/>
@@ -4435,7 +5357,7 @@
           <w:color w:val="auto"/>
         </w:rPr>
       </w:pPr>
-      <w:bookmarkStart w:id="7" w:name="_Toc243583136"/>
+      <w:bookmarkStart w:id="7" w:name="_Toc243660188"/>
       <w:r>
         <w:rPr>
           <w:color w:val="auto"/>
@@ -4473,7 +5395,7 @@
           <w:color w:val="auto"/>
         </w:rPr>
       </w:pPr>
-      <w:bookmarkStart w:id="8" w:name="_Toc243583137"/>
+      <w:bookmarkStart w:id="8" w:name="_Toc243660189"/>
       <w:r>
         <w:rPr>
           <w:color w:val="auto"/>
@@ -4645,7 +5567,7 @@
           <w:color w:val="auto"/>
         </w:rPr>
       </w:pPr>
-      <w:bookmarkStart w:id="9" w:name="_Toc243583138"/>
+      <w:bookmarkStart w:id="9" w:name="_Toc243660190"/>
       <w:r>
         <w:rPr>
           <w:color w:val="auto"/>
@@ -5130,7 +6052,7 @@
           <w:szCs w:val="32"/>
         </w:rPr>
       </w:pPr>
-      <w:bookmarkStart w:id="12" w:name="_Toc243583139"/>
+      <w:bookmarkStart w:id="12" w:name="_Toc243660191"/>
       <w:r>
         <w:rPr>
           <w:color w:val="auto"/>
@@ -5172,7 +6094,7 @@
           <w:color w:val="auto"/>
         </w:rPr>
       </w:pPr>
-      <w:bookmarkStart w:id="13" w:name="_Toc243583140"/>
+      <w:bookmarkStart w:id="13" w:name="_Toc243660192"/>
       <w:r>
         <w:rPr>
           <w:color w:val="auto"/>
@@ -5406,7 +6328,7 @@
           <w:color w:val="auto"/>
         </w:rPr>
       </w:pPr>
-      <w:bookmarkStart w:id="14" w:name="_Toc243583141"/>
+      <w:bookmarkStart w:id="14" w:name="_Toc243660193"/>
       <w:r>
         <w:rPr>
           <w:color w:val="auto"/>
@@ -5771,7 +6693,7 @@
           <w:szCs w:val="32"/>
         </w:rPr>
       </w:pPr>
-      <w:bookmarkStart w:id="17" w:name="_Toc243583142"/>
+      <w:bookmarkStart w:id="17" w:name="_Toc243660194"/>
       <w:r>
         <w:rPr>
           <w:color w:val="auto"/>
@@ -6172,7 +7094,7 @@
           <w:color w:val="auto"/>
         </w:rPr>
       </w:pPr>
-      <w:bookmarkStart w:id="20" w:name="_Toc243583143"/>
+      <w:bookmarkStart w:id="20" w:name="_Toc243660195"/>
       <w:r>
         <w:rPr>
           <w:color w:val="auto"/>
@@ -7111,7 +8033,7 @@
           <w:color w:val="auto"/>
         </w:rPr>
       </w:pPr>
-      <w:bookmarkStart w:id="23" w:name="_Toc243583144"/>
+      <w:bookmarkStart w:id="23" w:name="_Toc243660196"/>
       <w:r>
         <w:rPr>
           <w:color w:val="auto"/>
@@ -7430,7 +8352,7 @@
           <w:color w:val="auto"/>
         </w:rPr>
       </w:pPr>
-      <w:bookmarkStart w:id="26" w:name="_Toc243583145"/>
+      <w:bookmarkStart w:id="26" w:name="_Toc243660197"/>
       <w:r>
         <w:rPr>
           <w:color w:val="auto"/>
@@ -7763,7 +8685,7 @@
           <w:szCs w:val="32"/>
         </w:rPr>
       </w:pPr>
-      <w:bookmarkStart w:id="27" w:name="_Toc243583146"/>
+      <w:bookmarkStart w:id="27" w:name="_Toc243660198"/>
       <w:r>
         <w:rPr>
           <w:color w:val="auto"/>
@@ -7783,7 +8705,7 @@
           <w:color w:val="auto"/>
         </w:rPr>
       </w:pPr>
-      <w:bookmarkStart w:id="28" w:name="_Toc243583147"/>
+      <w:bookmarkStart w:id="28" w:name="_Toc243660199"/>
       <w:r>
         <w:rPr>
           <w:color w:val="auto"/>
@@ -8408,6 +9330,7 @@
                                 <w:noProof/>
                               </w:rPr>
                             </w:pPr>
+                            <w:bookmarkStart w:id="31" w:name="_Toc243660221"/>
                             <w:r>
                               <w:t xml:space="preserve">Figura </w:t>
                             </w:r>
@@ -8422,11 +9345,10 @@
                             <w:r>
                               <w:t xml:space="preserve">– Transformação 02_join_transfers_appearances no </w:t>
                             </w:r>
-                            <w:proofErr w:type="spellStart"/>
                             <w:r>
                               <w:t>Spoon</w:t>
                             </w:r>
-                            <w:proofErr w:type="spellEnd"/>
+                            <w:bookmarkEnd w:id="31"/>
                           </w:p>
                         </w:txbxContent>
                       </wps:txbx>
@@ -8454,6 +9376,7 @@
                           <w:noProof/>
                         </w:rPr>
                       </w:pPr>
+                      <w:bookmarkStart w:id="32" w:name="_Toc243660221"/>
                       <w:r>
                         <w:t xml:space="preserve">Figura </w:t>
                       </w:r>
@@ -8468,11 +9391,10 @@
                       <w:r>
                         <w:t xml:space="preserve">– Transformação 02_join_transfers_appearances no </w:t>
                       </w:r>
-                      <w:proofErr w:type="spellStart"/>
                       <w:r>
                         <w:t>Spoon</w:t>
                       </w:r>
-                      <w:proofErr w:type="spellEnd"/>
+                      <w:bookmarkEnd w:id="32"/>
                     </w:p>
                   </w:txbxContent>
                 </v:textbox>
@@ -8487,7 +9409,7 @@
           <w:noProof/>
         </w:rPr>
         <w:drawing>
-          <wp:anchor distT="0" distB="0" distL="114300" distR="114300" simplePos="0" relativeHeight="251662336" behindDoc="0" locked="0" layoutInCell="1" allowOverlap="1" wp14:anchorId="21C05685" wp14:editId="7FD4DC97">
+          <wp:anchor distT="0" distB="0" distL="114300" distR="114300" simplePos="0" relativeHeight="251662336" behindDoc="0" locked="0" layoutInCell="1" allowOverlap="1" wp14:anchorId="21C05685" wp14:editId="76A82A6F">
             <wp:simplePos x="0" y="0"/>
             <wp:positionH relativeFrom="margin">
               <wp:align>left</wp:align>
@@ -10547,7 +11469,7 @@
       <w:pPr>
         <w:pStyle w:val="Legenda"/>
       </w:pPr>
-      <w:bookmarkStart w:id="31" w:name="_Toc243578485"/>
+      <w:bookmarkStart w:id="33" w:name="_Toc243578485"/>
       <w:r>
         <w:t xml:space="preserve">Tabela </w:t>
       </w:r>
@@ -10562,7 +11484,7 @@
       <w:r>
         <w:t>– Métricas calculadas</w:t>
       </w:r>
-      <w:bookmarkEnd w:id="31"/>
+      <w:bookmarkEnd w:id="33"/>
     </w:p>
     <w:p>
       <w:pPr>
@@ -10613,6 +11535,7 @@
       <w:pPr>
         <w:pStyle w:val="Legenda"/>
       </w:pPr>
+      <w:bookmarkStart w:id="34" w:name="_Toc243660222"/>
       <w:r>
         <w:t xml:space="preserve">Figura </w:t>
       </w:r>
@@ -10627,6 +11550,7 @@
       <w:r>
         <w:t>– Linhas lidas e escritas por passo</w:t>
       </w:r>
+      <w:bookmarkEnd w:id="34"/>
     </w:p>
     <w:p/>
     <w:p/>
@@ -11054,7 +11978,7 @@
       <w:pPr>
         <w:pStyle w:val="Legenda"/>
       </w:pPr>
-      <w:bookmarkStart w:id="32" w:name="_Toc243578486"/>
+      <w:bookmarkStart w:id="35" w:name="_Toc243578486"/>
       <w:r>
         <w:t xml:space="preserve">Tabela </w:t>
       </w:r>
@@ -11069,7 +11993,7 @@
       <w:r>
         <w:t>– Resultados da execução da transformação 02</w:t>
       </w:r>
-      <w:bookmarkEnd w:id="32"/>
+      <w:bookmarkEnd w:id="35"/>
     </w:p>
     <w:p/>
     <w:p>
@@ -11163,6 +12087,7 @@
       <w:pPr>
         <w:pStyle w:val="Legenda"/>
       </w:pPr>
+      <w:bookmarkStart w:id="36" w:name="_Toc243660223"/>
       <w:r>
         <w:t xml:space="preserve">Figura </w:t>
       </w:r>
@@ -11177,6 +12102,7 @@
       <w:r>
         <w:t>– Resultado da transformação 02</w:t>
       </w:r>
+      <w:bookmarkEnd w:id="36"/>
     </w:p>
     <w:p>
       <w:pPr>
@@ -11185,7 +12111,7 @@
           <w:color w:val="auto"/>
         </w:rPr>
       </w:pPr>
-      <w:bookmarkStart w:id="33" w:name="_Toc243583148"/>
+      <w:bookmarkStart w:id="37" w:name="_Toc243660200"/>
       <w:r>
         <w:rPr>
           <w:color w:val="auto"/>
@@ -11193,7 +12119,7 @@
         <w:lastRenderedPageBreak/>
         <w:t>4.2 Transformação 03 – Enriquecer, classificar e carregar</w:t>
       </w:r>
-      <w:bookmarkEnd w:id="33"/>
+      <w:bookmarkEnd w:id="37"/>
       <w:r>
         <w:rPr>
           <w:color w:val="auto"/>
@@ -11270,6 +12196,7 @@
         <w:pStyle w:val="Legenda"/>
         <w:jc w:val="both"/>
       </w:pPr>
+      <w:bookmarkStart w:id="38" w:name="_Toc243660224"/>
       <w:r>
         <w:t xml:space="preserve">Figura </w:t>
       </w:r>
@@ -11288,6 +12215,7 @@
       <w:r>
         <w:t>Spoon</w:t>
       </w:r>
+      <w:bookmarkEnd w:id="38"/>
       <w:proofErr w:type="spellEnd"/>
     </w:p>
     <w:p>
@@ -12710,7 +13638,7 @@
       <w:pPr>
         <w:pStyle w:val="Legenda"/>
       </w:pPr>
-      <w:bookmarkStart w:id="34" w:name="_Toc243578487"/>
+      <w:bookmarkStart w:id="39" w:name="_Toc243578487"/>
       <w:r>
         <w:t xml:space="preserve">Tabela </w:t>
       </w:r>
@@ -12725,7 +13653,7 @@
       <w:r>
         <w:t>– Passos da transformação 03</w:t>
       </w:r>
-      <w:bookmarkEnd w:id="34"/>
+      <w:bookmarkEnd w:id="39"/>
     </w:p>
     <w:p>
       <w:pPr>
@@ -12953,7 +13881,7 @@
       <w:pPr>
         <w:pStyle w:val="Legenda"/>
       </w:pPr>
-      <w:bookmarkStart w:id="35" w:name="_Toc243578488"/>
+      <w:bookmarkStart w:id="40" w:name="_Toc243578488"/>
       <w:r>
         <w:t xml:space="preserve">Tabela </w:t>
       </w:r>
@@ -12968,7 +13896,7 @@
       <w:r>
         <w:t>– Expressões regulares</w:t>
       </w:r>
-      <w:bookmarkEnd w:id="35"/>
+      <w:bookmarkEnd w:id="40"/>
     </w:p>
     <w:p>
       <w:pPr>
@@ -13019,6 +13947,7 @@
       <w:pPr>
         <w:pStyle w:val="Legenda"/>
       </w:pPr>
+      <w:bookmarkStart w:id="41" w:name="_Toc243660225"/>
       <w:r>
         <w:t xml:space="preserve">Figura </w:t>
       </w:r>
@@ -13036,6 +13965,7 @@
       <w:r>
         <w:t>antes da limpeza</w:t>
       </w:r>
+      <w:bookmarkEnd w:id="41"/>
     </w:p>
     <w:p>
       <w:pPr>
@@ -13086,6 +14016,7 @@
       <w:pPr>
         <w:pStyle w:val="Legenda"/>
       </w:pPr>
+      <w:bookmarkStart w:id="42" w:name="_Toc243660226"/>
       <w:r>
         <w:t xml:space="preserve">Figura </w:t>
       </w:r>
@@ -13106,6 +14037,7 @@
       <w:r>
         <w:t xml:space="preserve"> da limpeza</w:t>
       </w:r>
+      <w:bookmarkEnd w:id="42"/>
       <w:r>
         <w:rPr>
           <w:highlight w:val="yellow"/>
@@ -13498,7 +14430,7 @@
       <w:pPr>
         <w:pStyle w:val="Legenda"/>
       </w:pPr>
-      <w:bookmarkStart w:id="36" w:name="_Toc243578489"/>
+      <w:bookmarkStart w:id="43" w:name="_Toc243578489"/>
       <w:r>
         <w:t xml:space="preserve">Tabela </w:t>
       </w:r>
@@ -13513,7 +14445,7 @@
       <w:r>
         <w:t>– Regras de classificação</w:t>
       </w:r>
-      <w:bookmarkEnd w:id="36"/>
+      <w:bookmarkEnd w:id="43"/>
     </w:p>
     <w:p>
       <w:pPr>
@@ -13564,6 +14496,7 @@
       <w:pPr>
         <w:pStyle w:val="Legenda"/>
       </w:pPr>
+      <w:bookmarkStart w:id="44" w:name="_Toc243660227"/>
       <w:r>
         <w:t xml:space="preserve">Figura </w:t>
       </w:r>
@@ -13578,6 +14511,7 @@
       <w:r>
         <w:t>– Passo de classificação</w:t>
       </w:r>
+      <w:bookmarkEnd w:id="44"/>
     </w:p>
     <w:p>
       <w:pPr>
@@ -13628,6 +14562,7 @@
       <w:pPr>
         <w:pStyle w:val="Legenda"/>
       </w:pPr>
+      <w:bookmarkStart w:id="45" w:name="_Toc243660228"/>
       <w:r>
         <w:t xml:space="preserve">Figura </w:t>
       </w:r>
@@ -13655,6 +14590,7 @@
       <w:r>
         <w:t xml:space="preserve"> para a classificação</w:t>
       </w:r>
+      <w:bookmarkEnd w:id="45"/>
     </w:p>
     <w:p>
       <w:pPr>
@@ -13902,7 +14838,7 @@
           <w:highlight w:val="yellow"/>
         </w:rPr>
       </w:pPr>
-      <w:bookmarkStart w:id="37" w:name="_Toc243578490"/>
+      <w:bookmarkStart w:id="46" w:name="_Toc243578490"/>
       <w:r>
         <w:t xml:space="preserve">Tabela </w:t>
       </w:r>
@@ -13917,7 +14853,7 @@
       <w:r>
         <w:t>– Resultados da execução da transformação 03</w:t>
       </w:r>
-      <w:bookmarkEnd w:id="37"/>
+      <w:bookmarkEnd w:id="46"/>
     </w:p>
     <w:p>
       <w:pPr>
@@ -13970,6 +14906,7 @@
       <w:pPr>
         <w:pStyle w:val="Legenda"/>
       </w:pPr>
+      <w:bookmarkStart w:id="47" w:name="_Toc243660229"/>
       <w:r>
         <w:t xml:space="preserve">Figura </w:t>
       </w:r>
@@ -13984,6 +14921,7 @@
       <w:r>
         <w:t>– Resultado da transformação 03</w:t>
       </w:r>
+      <w:bookmarkEnd w:id="47"/>
     </w:p>
     <w:p>
       <w:pPr>
@@ -14063,6 +15001,7 @@
       <w:pPr>
         <w:pStyle w:val="Legenda"/>
       </w:pPr>
+      <w:bookmarkStart w:id="48" w:name="_Toc243660230"/>
       <w:r>
         <w:t xml:space="preserve">Figura </w:t>
       </w:r>
@@ -14085,6 +15024,7 @@
       <w:r>
         <w:t xml:space="preserve"> Workbench</w:t>
       </w:r>
+      <w:bookmarkEnd w:id="48"/>
     </w:p>
     <w:p>
       <w:pPr>
@@ -14354,7 +15294,7 @@
       <w:pPr>
         <w:pStyle w:val="Legenda"/>
       </w:pPr>
-      <w:bookmarkStart w:id="38" w:name="_Toc243578491"/>
+      <w:bookmarkStart w:id="49" w:name="_Toc243578491"/>
       <w:r>
         <w:t xml:space="preserve">Tabela </w:t>
       </w:r>
@@ -14369,7 +15309,7 @@
       <w:r>
         <w:t>– Problemas de qualidade e respetivo tratamento</w:t>
       </w:r>
-      <w:bookmarkEnd w:id="38"/>
+      <w:bookmarkEnd w:id="49"/>
     </w:p>
     <w:p>
       <w:pPr>
@@ -14380,7 +15320,7 @@
           <w:szCs w:val="32"/>
         </w:rPr>
       </w:pPr>
-      <w:bookmarkStart w:id="39" w:name="_Toc243583149"/>
+      <w:bookmarkStart w:id="50" w:name="_Toc243660201"/>
       <w:r>
         <w:rPr>
           <w:color w:val="auto"/>
@@ -14389,7 +15329,7 @@
         </w:rPr>
         <w:t>5. Jobs</w:t>
       </w:r>
-      <w:bookmarkEnd w:id="39"/>
+      <w:bookmarkEnd w:id="50"/>
     </w:p>
     <w:p>
       <w:pPr>
@@ -14446,14 +15386,14 @@
           <w:color w:val="auto"/>
         </w:rPr>
       </w:pPr>
-      <w:bookmarkStart w:id="40" w:name="_Toc243583150"/>
+      <w:bookmarkStart w:id="51" w:name="_Toc243660202"/>
       <w:r>
         <w:rPr>
           <w:color w:val="auto"/>
         </w:rPr>
         <w:t>5.1 Job Principal</w:t>
       </w:r>
-      <w:bookmarkEnd w:id="40"/>
+      <w:bookmarkEnd w:id="51"/>
     </w:p>
     <w:p>
       <w:pPr>
@@ -14508,6 +15448,7 @@
         <w:pStyle w:val="Legenda"/>
         <w:jc w:val="both"/>
       </w:pPr>
+      <w:bookmarkStart w:id="52" w:name="_Toc243660231"/>
       <w:r>
         <w:t xml:space="preserve">Figura </w:t>
       </w:r>
@@ -14526,6 +15467,7 @@
       <w:r>
         <w:t>Spoon</w:t>
       </w:r>
+      <w:bookmarkEnd w:id="52"/>
       <w:proofErr w:type="spellEnd"/>
     </w:p>
     <w:p>
@@ -15259,7 +16201,7 @@
       <w:pPr>
         <w:pStyle w:val="Legenda"/>
       </w:pPr>
-      <w:bookmarkStart w:id="41" w:name="_Toc243578492"/>
+      <w:bookmarkStart w:id="53" w:name="_Toc243578492"/>
       <w:r>
         <w:t xml:space="preserve">Tabela </w:t>
       </w:r>
@@ -15274,7 +16216,7 @@
       <w:r>
         <w:t>– Entradas do job principal</w:t>
       </w:r>
-      <w:bookmarkEnd w:id="41"/>
+      <w:bookmarkEnd w:id="53"/>
     </w:p>
     <w:p>
       <w:pPr>
@@ -15283,14 +16225,14 @@
           <w:color w:val="auto"/>
         </w:rPr>
       </w:pPr>
-      <w:bookmarkStart w:id="42" w:name="_Toc243583151"/>
+      <w:bookmarkStart w:id="54" w:name="_Toc243660203"/>
       <w:r>
         <w:rPr>
           <w:color w:val="auto"/>
         </w:rPr>
         <w:t>5.2 Tratamento de Erros</w:t>
       </w:r>
-      <w:bookmarkEnd w:id="42"/>
+      <w:bookmarkEnd w:id="54"/>
     </w:p>
     <w:p>
       <w:pPr>
@@ -15347,14 +16289,14 @@
           <w:color w:val="auto"/>
         </w:rPr>
       </w:pPr>
-      <w:bookmarkStart w:id="43" w:name="_Toc243583152"/>
+      <w:bookmarkStart w:id="55" w:name="_Toc243660204"/>
       <w:r>
         <w:rPr>
           <w:color w:val="auto"/>
         </w:rPr>
         <w:t>5.3 Serviços Remotos: Email</w:t>
       </w:r>
-      <w:bookmarkEnd w:id="43"/>
+      <w:bookmarkEnd w:id="55"/>
     </w:p>
     <w:p>
       <w:pPr>
@@ -15470,6 +16412,7 @@
         <w:pStyle w:val="Legenda"/>
         <w:jc w:val="both"/>
       </w:pPr>
+      <w:bookmarkStart w:id="56" w:name="_Toc243660232"/>
       <w:r>
         <w:t xml:space="preserve">Figura </w:t>
       </w:r>
@@ -15484,6 +16427,7 @@
       <w:r>
         <w:t>– Email enviado pelo job</w:t>
       </w:r>
+      <w:bookmarkEnd w:id="56"/>
     </w:p>
     <w:p>
       <w:pPr>
@@ -15501,7 +16445,7 @@
           <w:color w:val="auto"/>
         </w:rPr>
       </w:pPr>
-      <w:bookmarkStart w:id="44" w:name="_Toc243583153"/>
+      <w:bookmarkStart w:id="57" w:name="_Toc243660205"/>
       <w:r>
         <w:rPr>
           <w:color w:val="auto"/>
@@ -15516,7 +16460,7 @@
         </w:rPr>
         <w:t>Logs</w:t>
       </w:r>
-      <w:bookmarkEnd w:id="44"/>
+      <w:bookmarkEnd w:id="57"/>
       <w:proofErr w:type="spellEnd"/>
     </w:p>
     <w:p>
@@ -15627,6 +16571,7 @@
         <w:pStyle w:val="Legenda"/>
         <w:jc w:val="both"/>
       </w:pPr>
+      <w:bookmarkStart w:id="58" w:name="_Toc243660233"/>
       <w:r>
         <w:t xml:space="preserve">Figura </w:t>
       </w:r>
@@ -15641,6 +16586,7 @@
       <w:r>
         <w:t>– Execução do job</w:t>
       </w:r>
+      <w:bookmarkEnd w:id="58"/>
     </w:p>
     <w:p>
       <w:pPr>
@@ -15649,14 +16595,14 @@
           <w:color w:val="auto"/>
         </w:rPr>
       </w:pPr>
-      <w:bookmarkStart w:id="45" w:name="_Toc243583154"/>
+      <w:bookmarkStart w:id="59" w:name="_Toc243660206"/>
       <w:r>
         <w:rPr>
           <w:color w:val="auto"/>
         </w:rPr>
         <w:t>5.5 Agendamento</w:t>
       </w:r>
-      <w:bookmarkEnd w:id="45"/>
+      <w:bookmarkEnd w:id="59"/>
     </w:p>
     <w:p>
       <w:pPr>
@@ -15707,7 +16653,7 @@
           <w:szCs w:val="32"/>
         </w:rPr>
       </w:pPr>
-      <w:bookmarkStart w:id="46" w:name="_Toc243583155"/>
+      <w:bookmarkStart w:id="60" w:name="_Toc243660207"/>
       <w:r>
         <w:rPr>
           <w:color w:val="auto"/>
@@ -15716,7 +16662,7 @@
         </w:rPr>
         <w:t>6.Demonstração</w:t>
       </w:r>
-      <w:bookmarkEnd w:id="46"/>
+      <w:bookmarkEnd w:id="60"/>
     </w:p>
     <w:p>
       <w:pPr>
@@ -15746,9 +16692,26 @@
       <w:pPr>
         <w:ind w:left="360"/>
       </w:pPr>
-      <w:r>
-        <w:t>https://drive.google.com/file/d/1gN69u3x7Osel6qRizAWxtm-s8E_I47Qh/view?usp=drive_link</w:t>
-      </w:r>
+      <w:hyperlink r:id="rId21" w:history="1">
+        <w:r>
+          <w:rPr>
+            <w:rStyle w:val="Hiperligao"/>
+          </w:rPr>
+          <w:t>https://drive.google.c</w:t>
+        </w:r>
+        <w:r>
+          <w:rPr>
+            <w:rStyle w:val="Hiperligao"/>
+          </w:rPr>
+          <w:t>o</w:t>
+        </w:r>
+        <w:r>
+          <w:rPr>
+            <w:rStyle w:val="Hiperligao"/>
+          </w:rPr>
+          <w:t>m/file/d/1gN69u3x7Osel6qRizAWxtm-s8E_I47Qh/view?usp=drive_link</w:t>
+        </w:r>
+      </w:hyperlink>
     </w:p>
     <w:p>
       <w:pPr>
@@ -15783,7 +16746,7 @@
           <w:color w:val="auto"/>
         </w:rPr>
       </w:pPr>
-      <w:bookmarkStart w:id="47" w:name="_Toc243583156"/>
+      <w:bookmarkStart w:id="61" w:name="_Toc243660208"/>
       <w:r>
         <w:rPr>
           <w:color w:val="auto"/>
@@ -15797,7 +16760,7 @@
         </w:rPr>
         <w:t>Dashboard</w:t>
       </w:r>
-      <w:bookmarkEnd w:id="47"/>
+      <w:bookmarkEnd w:id="61"/>
       <w:proofErr w:type="spellEnd"/>
     </w:p>
     <w:p>
@@ -16009,7 +16972,7 @@
                     <pic:cNvPicPr/>
                   </pic:nvPicPr>
                   <pic:blipFill>
-                    <a:blip r:embed="rId21"/>
+                    <a:blip r:embed="rId22"/>
                     <a:stretch>
                       <a:fillRect/>
                     </a:stretch>
@@ -16041,6 +17004,7 @@
           <w:szCs w:val="20"/>
         </w:rPr>
       </w:pPr>
+      <w:bookmarkStart w:id="62" w:name="_Toc243660234"/>
       <w:r>
         <w:t xml:space="preserve">Figura </w:t>
       </w:r>
@@ -16071,6 +17035,7 @@
       <w:r>
         <w:t xml:space="preserve"> BI</w:t>
       </w:r>
+      <w:bookmarkEnd w:id="62"/>
     </w:p>
     <w:p>
       <w:pPr>
@@ -16268,7 +17233,7 @@
           <w:szCs w:val="32"/>
         </w:rPr>
       </w:pPr>
-      <w:bookmarkStart w:id="48" w:name="_Toc243583157"/>
+      <w:bookmarkStart w:id="63" w:name="_Toc243660209"/>
       <w:r>
         <w:rPr>
           <w:color w:val="auto"/>
@@ -16278,7 +17243,7 @@
         <w:lastRenderedPageBreak/>
         <w:t>7. Conclusão e Trabalhos Futuros</w:t>
       </w:r>
-      <w:bookmarkEnd w:id="48"/>
+      <w:bookmarkEnd w:id="63"/>
     </w:p>
     <w:p>
       <w:pPr>
@@ -16287,14 +17252,14 @@
           <w:color w:val="auto"/>
         </w:rPr>
       </w:pPr>
-      <w:bookmarkStart w:id="49" w:name="_Toc243583158"/>
+      <w:bookmarkStart w:id="64" w:name="_Toc243660210"/>
       <w:r>
         <w:rPr>
           <w:color w:val="auto"/>
         </w:rPr>
         <w:t>7.1 Conclusão</w:t>
       </w:r>
-      <w:bookmarkEnd w:id="49"/>
+      <w:bookmarkEnd w:id="64"/>
     </w:p>
     <w:p>
       <w:pPr>
@@ -16383,14 +17348,14 @@
           <w:color w:val="auto"/>
         </w:rPr>
       </w:pPr>
-      <w:bookmarkStart w:id="50" w:name="_Toc243583159"/>
+      <w:bookmarkStart w:id="65" w:name="_Toc243660211"/>
       <w:r>
         <w:rPr>
           <w:color w:val="auto"/>
         </w:rPr>
         <w:t>7.3 Trabalhos Futuros</w:t>
       </w:r>
-      <w:bookmarkEnd w:id="50"/>
+      <w:bookmarkEnd w:id="65"/>
     </w:p>
     <w:p>
       <w:pPr>
@@ -16586,7 +17551,7 @@
           <w:szCs w:val="32"/>
         </w:rPr>
       </w:pPr>
-      <w:bookmarkStart w:id="51" w:name="_Toc243583160"/>
+      <w:bookmarkStart w:id="66" w:name="_Toc243660212"/>
       <w:r>
         <w:rPr>
           <w:color w:val="auto"/>
@@ -16595,7 +17560,7 @@
         </w:rPr>
         <w:t>8. Referências</w:t>
       </w:r>
-      <w:bookmarkEnd w:id="51"/>
+      <w:bookmarkEnd w:id="66"/>
     </w:p>
     <w:p>
       <w:pPr>
@@ -16608,7 +17573,7 @@
           <w:szCs w:val="20"/>
         </w:rPr>
       </w:pPr>
-      <w:hyperlink r:id="rId22" w:tgtFrame="_blank" w:history="1">
+      <w:hyperlink r:id="rId23" w:tgtFrame="_blank" w:history="1">
         <w:proofErr w:type="spellStart"/>
         <w:r>
           <w:rPr>
@@ -16673,7 +17638,7 @@
           <w:szCs w:val="20"/>
         </w:rPr>
       </w:pPr>
-      <w:hyperlink r:id="rId23" w:tgtFrame="_blank" w:history="1">
+      <w:hyperlink r:id="rId24" w:tgtFrame="_blank" w:history="1">
         <w:proofErr w:type="spellStart"/>
         <w:r>
           <w:rPr>
@@ -16722,7 +17687,7 @@
           <w:szCs w:val="20"/>
         </w:rPr>
       </w:pPr>
-      <w:hyperlink r:id="rId24" w:tgtFrame="_blank" w:history="1">
+      <w:hyperlink r:id="rId25" w:tgtFrame="_blank" w:history="1">
         <w:proofErr w:type="spellStart"/>
         <w:r>
           <w:rPr>
@@ -18895,6 +19860,18 @@
       <w:shd w:val="clear" w:color="auto" w:fill="E1DFDD"/>
     </w:rPr>
   </w:style>
+  <w:style w:type="character" w:styleId="Hiperligaovisitada">
+    <w:name w:val="FollowedHyperlink"/>
+    <w:basedOn w:val="Tipodeletrapredefinidodopargrafo"/>
+    <w:uiPriority w:val="99"/>
+    <w:semiHidden/>
+    <w:unhideWhenUsed/>
+    <w:rsid w:val="00285826"/>
+    <w:rPr>
+      <w:color w:val="96607D" w:themeColor="followedHyperlink"/>
+      <w:u w:val="single"/>
+    </w:rPr>
+  </w:style>
 </w:styles>
 </file>
 

</xml_diff>